<commit_message>
Close PX-034 v3 integrity gaps
</commit_message>
<xml_diff>
--- a/PX-034_Conflict-Aware_CTI_Routing_Proposal.docx
+++ b/PX-034_Conflict-Aware_CTI_Routing_Proposal.docx
@@ -562,7 +562,7 @@
           <w:sz w:val="21"/>
           <w:szCs w:val="21"/>
         </w:rPr>
-        <w:t xml:space="preserve">Routing pays. A pipeline that acts on the predicted state beats always-retrieve and never-retrieve at matched coverage, per task category.</w:t>
+        <w:t xml:space="preserve">Abstention pays. A policy that abstains on predicted conflicting, stale, or other evidence beats always-retrieve and never-retrieve at matched coverage, per task category.</w:t>
       </w:r>
     </w:p>
     <w:p>
@@ -779,7 +779,7 @@
           <w:sz w:val="22"/>
           <w:szCs w:val="22"/>
         </w:rPr>
-        <w:t xml:space="preserve">Does routing on predicted state beat uniform strategies?</w:t>
+        <w:t xml:space="preserve">Does state-conditioned abstention beat always-retrieve and never-retrieve at matched coverage?</w:t>
       </w:r>
     </w:p>
     <w:p>
@@ -1518,7 +1518,7 @@
                 <w:sz w:val="19"/>
                 <w:szCs w:val="19"/>
               </w:rPr>
-              <w:t xml:space="preserve">Structural router</w:t>
+              <w:t xml:space="preserve">Structural abstention policy</w:t>
             </w:r>
           </w:p>
         </w:tc>
@@ -1777,7 +1777,7 @@
           <w:sz w:val="21"/>
           <w:szCs w:val="21"/>
         </w:rPr>
-        <w:t xml:space="preserve">Option-aware versus option-blind detector; each structural feature group removed in turn; router with abstention disabled, to separate routing value from abstention value.</w:t>
+        <w:t xml:space="preserve">Option-aware versus option-blind detector; each structural feature group removed in turn; abstention disabled, to isolate the value of state-conditioned abstention.</w:t>
       </w:r>
     </w:p>
     <w:p>

</xml_diff>